<commit_message>
lesson template: plan number black, dotted-border lines fill panel width
</commit_message>
<xml_diff>
--- a/lesson-template-preview.docx
+++ b/lesson-template-preview.docx
@@ -54,7 +54,6 @@
                 <w:rFonts w:ascii="TH SarabunPSK" w:cs="TH SarabunPSK" w:eastAsia="TH SarabunPSK" w:hAnsi="TH SarabunPSK"/>
                 <w:b/>
                 <w:bCs/>
-                <w:color w:val="D9534F"/>
                 <w:sz w:val="30"/>
                 <w:szCs w:val="30"/>
               </w:rPr>
@@ -1731,36 +1730,51 @@
             </w:r>
           </w:p>
           <w:p>
+            <w:pPr>
+              <w:pBdr>
+                <w:bottom w:val="dotted" w:color="6B7280" w:sz="8" w:space="4"/>
+              </w:pBdr>
+              <w:spacing w:after="180"/>
+            </w:pPr>
             <w:r>
               <w:rPr>
                 <w:rFonts w:ascii="TH SarabunPSK" w:cs="TH SarabunPSK" w:eastAsia="TH SarabunPSK" w:hAnsi="TH SarabunPSK"/>
-                <w:color w:val="6B7280"/>
                 <w:sz w:val="22"/>
                 <w:szCs w:val="22"/>
               </w:rPr>
-              <w:t xml:space="preserve">............................................................................................................................................</w:t>
+              <w:t xml:space="preserve"> </w:t>
             </w:r>
           </w:p>
           <w:p>
+            <w:pPr>
+              <w:pBdr>
+                <w:bottom w:val="dotted" w:color="6B7280" w:sz="8" w:space="4"/>
+              </w:pBdr>
+              <w:spacing w:after="180"/>
+            </w:pPr>
             <w:r>
               <w:rPr>
                 <w:rFonts w:ascii="TH SarabunPSK" w:cs="TH SarabunPSK" w:eastAsia="TH SarabunPSK" w:hAnsi="TH SarabunPSK"/>
-                <w:color w:val="6B7280"/>
                 <w:sz w:val="22"/>
                 <w:szCs w:val="22"/>
               </w:rPr>
-              <w:t xml:space="preserve">............................................................................................................................................</w:t>
+              <w:t xml:space="preserve"> </w:t>
             </w:r>
           </w:p>
           <w:p>
+            <w:pPr>
+              <w:pBdr>
+                <w:bottom w:val="dotted" w:color="6B7280" w:sz="8" w:space="4"/>
+              </w:pBdr>
+              <w:spacing w:after="180"/>
+            </w:pPr>
             <w:r>
               <w:rPr>
                 <w:rFonts w:ascii="TH SarabunPSK" w:cs="TH SarabunPSK" w:eastAsia="TH SarabunPSK" w:hAnsi="TH SarabunPSK"/>
-                <w:color w:val="6B7280"/>
                 <w:sz w:val="22"/>
                 <w:szCs w:val="22"/>
               </w:rPr>
-              <w:t xml:space="preserve">............................................................................................................................................</w:t>
+              <w:t xml:space="preserve"> </w:t>
             </w:r>
           </w:p>
         </w:tc>

</xml_diff>

<commit_message>
lesson template: 4 note lines, no trailing spacing on last
</commit_message>
<xml_diff>
--- a/lesson-template-preview.docx
+++ b/lesson-template-preview.docx
@@ -1777,6 +1777,22 @@
               <w:t xml:space="preserve"> </w:t>
             </w:r>
           </w:p>
+          <w:p>
+            <w:pPr>
+              <w:pBdr>
+                <w:bottom w:val="dotted" w:color="6B7280" w:sz="8" w:space="4"/>
+              </w:pBdr>
+              <w:spacing w:after="0"/>
+            </w:pPr>
+            <w:r>
+              <w:rPr>
+                <w:rFonts w:ascii="TH SarabunPSK" w:cs="TH SarabunPSK" w:eastAsia="TH SarabunPSK" w:hAnsi="TH SarabunPSK"/>
+                <w:sz w:val="22"/>
+                <w:szCs w:val="22"/>
+              </w:rPr>
+              <w:t xml:space="preserve"> </w:t>
+            </w:r>
+          </w:p>
         </w:tc>
       </w:tr>
     </w:tbl>

</xml_diff>